<commit_message>
Cargar datos reales: nombre, email y links
</commit_message>
<xml_diff>
--- a/CV_Programador.docx
+++ b/CV_Programador.docx
@@ -15,7 +15,7 @@
           <w:sz w:val="40"/>
           <w:szCs w:val="40"/>
         </w:rPr>
-        <w:t xml:space="preserve">[ TU NOMBRE Y APELLIDO ]</w:t>
+        <w:t xml:space="preserve">Emmanuel Moreno Halberstadt</w:t>
       </w:r>
     </w:p>
     <w:p>
@@ -45,14 +45,14 @@
         </w:rPr>
         <w:t xml:space="preserve">Córdoba, Argentina  ·  +54 9 351 000 0000  ·  </w:t>
       </w:r>
-      <w:hyperlink w:history="1" r:id="rIdjqnmac6gdhalvzlwdejkt">
+      <w:hyperlink w:history="1" r:id="rIdjdrs5qhv5udnjcp01npp7">
         <w:r>
           <w:rPr>
             <w:rStyle w:val="Hyperlink"/>
             <w:sz w:val="19"/>
             <w:szCs w:val="19"/>
           </w:rPr>
-          <w:t xml:space="preserve">tucorreo@gmail.com</w:t>
+          <w:t xml:space="preserve">emmanuel.moreno.halberstadt.dev@gmail.com</w:t>
         </w:r>
       </w:hyperlink>
     </w:p>
@@ -61,14 +61,14 @@
         <w:spacing w:after="60"/>
         <w:jc w:val="center"/>
       </w:pPr>
-      <w:hyperlink w:history="1" r:id="rIdwjfab0p8esutqkubwwsis">
+      <w:hyperlink w:history="1" r:id="rIdgshiv43dig9nm9o_t748f">
         <w:r>
           <w:rPr>
             <w:rStyle w:val="Hyperlink"/>
             <w:sz w:val="19"/>
             <w:szCs w:val="19"/>
           </w:rPr>
-          <w:t xml:space="preserve">github.com/tu-usuario</w:t>
+          <w:t xml:space="preserve">github.com/emmanuel-morenoh</w:t>
         </w:r>
       </w:hyperlink>
       <w:r>
@@ -79,14 +79,14 @@
         </w:rPr>
         <w:t xml:space="preserve">   ·   </w:t>
       </w:r>
-      <w:hyperlink w:history="1" r:id="rIdjw7ted5qaom-s1hl7p28p">
+      <w:hyperlink w:history="1" r:id="rIdafvq5wmwtqgshno-ynysx">
         <w:r>
           <w:rPr>
             <w:rStyle w:val="Hyperlink"/>
             <w:sz w:val="19"/>
             <w:szCs w:val="19"/>
           </w:rPr>
-          <w:t xml:space="preserve">linkedin.com/in/tu-usuario</w:t>
+          <w:t xml:space="preserve">emmanuel-morenoh.github.io/portfolio</w:t>
         </w:r>
       </w:hyperlink>
     </w:p>

</xml_diff>

<commit_message>
Usuario de GitHub real: Emmanuel-Halberstadt
</commit_message>
<xml_diff>
--- a/CV_Programador.docx
+++ b/CV_Programador.docx
@@ -45,7 +45,7 @@
         </w:rPr>
         <w:t xml:space="preserve">Córdoba, Argentina  ·  +54 9 351 000 0000  ·  </w:t>
       </w:r>
-      <w:hyperlink w:history="1" r:id="rIdjdrs5qhv5udnjcp01npp7">
+      <w:hyperlink w:history="1" r:id="rIdbndtfdmvyrxsv5plqr7in">
         <w:r>
           <w:rPr>
             <w:rStyle w:val="Hyperlink"/>
@@ -61,14 +61,14 @@
         <w:spacing w:after="60"/>
         <w:jc w:val="center"/>
       </w:pPr>
-      <w:hyperlink w:history="1" r:id="rIdgshiv43dig9nm9o_t748f">
+      <w:hyperlink w:history="1" r:id="rIdbsfmk0w9jmaei9xujuvvr">
         <w:r>
           <w:rPr>
             <w:rStyle w:val="Hyperlink"/>
             <w:sz w:val="19"/>
             <w:szCs w:val="19"/>
           </w:rPr>
-          <w:t xml:space="preserve">github.com/emmanuel-morenoh</w:t>
+          <w:t xml:space="preserve">github.com/Emmanuel-Halberstadt</w:t>
         </w:r>
       </w:hyperlink>
       <w:r>
@@ -79,14 +79,14 @@
         </w:rPr>
         <w:t xml:space="preserve">   ·   </w:t>
       </w:r>
-      <w:hyperlink w:history="1" r:id="rIdafvq5wmwtqgshno-ynysx">
+      <w:hyperlink w:history="1" r:id="rIdm0kncy4hhx-m_h2lmqldd">
         <w:r>
           <w:rPr>
             <w:rStyle w:val="Hyperlink"/>
             <w:sz w:val="19"/>
             <w:szCs w:val="19"/>
           </w:rPr>
-          <w:t xml:space="preserve">emmanuel-morenoh.github.io/portfolio</w:t>
+          <w:t xml:space="preserve">emmanuel-halberstadt.github.io/portfolio</w:t>
         </w:r>
       </w:hyperlink>
     </w:p>

</xml_diff>

<commit_message>
Agregar telefono real y LinkedIn
</commit_message>
<xml_diff>
--- a/CV_Programador.docx
+++ b/CV_Programador.docx
@@ -43,9 +43,9 @@
           <w:sz w:val="19"/>
           <w:szCs w:val="19"/>
         </w:rPr>
-        <w:t xml:space="preserve">Córdoba, Argentina  ·  +54 9 351 000 0000  ·  </w:t>
-      </w:r>
-      <w:hyperlink w:history="1" r:id="rIdbndtfdmvyrxsv5plqr7in">
+        <w:t xml:space="preserve">Córdoba, Argentina  ·  +54 9 351 370 3119  ·  </w:t>
+      </w:r>
+      <w:hyperlink w:history="1" r:id="rIddi46m1ib2gfm2bbxysi-q">
         <w:r>
           <w:rPr>
             <w:rStyle w:val="Hyperlink"/>
@@ -61,7 +61,7 @@
         <w:spacing w:after="60"/>
         <w:jc w:val="center"/>
       </w:pPr>
-      <w:hyperlink w:history="1" r:id="rIdbsfmk0w9jmaei9xujuvvr">
+      <w:hyperlink w:history="1" r:id="rIdiskifhwp9g6skfydrvurn">
         <w:r>
           <w:rPr>
             <w:rStyle w:val="Hyperlink"/>
@@ -79,7 +79,7 @@
         </w:rPr>
         <w:t xml:space="preserve">   ·   </w:t>
       </w:r>
-      <w:hyperlink w:history="1" r:id="rIdm0kncy4hhx-m_h2lmqldd">
+      <w:hyperlink w:history="1" r:id="rIdee2_q2g22ubcmsvbrf-ho">
         <w:r>
           <w:rPr>
             <w:rStyle w:val="Hyperlink"/>
@@ -87,6 +87,24 @@
             <w:szCs w:val="19"/>
           </w:rPr>
           <w:t xml:space="preserve">emmanuel-halberstadt.github.io/portfolio</w:t>
+        </w:r>
+      </w:hyperlink>
+      <w:r>
+        <w:rPr>
+          <w:color w:val="404040"/>
+          <w:sz w:val="19"/>
+          <w:szCs w:val="19"/>
+        </w:rPr>
+        <w:t xml:space="preserve">   ·   </w:t>
+      </w:r>
+      <w:hyperlink w:history="1" r:id="rIdsblxhvaey5m-mhzcicirp">
+        <w:r>
+          <w:rPr>
+            <w:rStyle w:val="Hyperlink"/>
+            <w:sz w:val="19"/>
+            <w:szCs w:val="19"/>
+          </w:rPr>
+          <w:t xml:space="preserve">linkedin.com/in/emmanuel-moreno-halberstadt</w:t>
         </w:r>
       </w:hyperlink>
     </w:p>

</xml_diff>

<commit_message>
Apuntar a cuenta emmanuelMorenohalberstadtDev + telefono/LinkedIn
</commit_message>
<xml_diff>
--- a/CV_Programador.docx
+++ b/CV_Programador.docx
@@ -45,7 +45,7 @@
         </w:rPr>
         <w:t xml:space="preserve">Córdoba, Argentina  ·  +54 9 351 370 3119  ·  </w:t>
       </w:r>
-      <w:hyperlink w:history="1" r:id="rIddi46m1ib2gfm2bbxysi-q">
+      <w:hyperlink w:history="1" r:id="rId5o4lemz7udfwb64ujfs5j">
         <w:r>
           <w:rPr>
             <w:rStyle w:val="Hyperlink"/>
@@ -61,14 +61,14 @@
         <w:spacing w:after="60"/>
         <w:jc w:val="center"/>
       </w:pPr>
-      <w:hyperlink w:history="1" r:id="rIdiskifhwp9g6skfydrvurn">
+      <w:hyperlink w:history="1" r:id="rIdm1zykpvriel3b_kpsasbp">
         <w:r>
           <w:rPr>
             <w:rStyle w:val="Hyperlink"/>
             <w:sz w:val="19"/>
             <w:szCs w:val="19"/>
           </w:rPr>
-          <w:t xml:space="preserve">github.com/Emmanuel-Halberstadt</w:t>
+          <w:t xml:space="preserve">github.com/emmanuelMorenohalberstadtDev</w:t>
         </w:r>
       </w:hyperlink>
       <w:r>
@@ -79,14 +79,14 @@
         </w:rPr>
         <w:t xml:space="preserve">   ·   </w:t>
       </w:r>
-      <w:hyperlink w:history="1" r:id="rIdee2_q2g22ubcmsvbrf-ho">
+      <w:hyperlink w:history="1" r:id="rIdcyhc2y1k932i0cbiquhc9">
         <w:r>
           <w:rPr>
             <w:rStyle w:val="Hyperlink"/>
             <w:sz w:val="19"/>
             <w:szCs w:val="19"/>
           </w:rPr>
-          <w:t xml:space="preserve">emmanuel-halberstadt.github.io/portfolio</w:t>
+          <w:t xml:space="preserve">emmanuelmorenohalberstadtdev.github.io/portfolio</w:t>
         </w:r>
       </w:hyperlink>
       <w:r>
@@ -97,7 +97,7 @@
         </w:rPr>
         <w:t xml:space="preserve">   ·   </w:t>
       </w:r>
-      <w:hyperlink w:history="1" r:id="rIdsblxhvaey5m-mhzcicirp">
+      <w:hyperlink w:history="1" r:id="rIdrk5_v3f2sg67lx5edlxrd">
         <w:r>
           <w:rPr>
             <w:rStyle w:val="Hyperlink"/>

</xml_diff>

<commit_message>
Tarjetas listas para proyectos + soporte de foto de perfil
</commit_message>
<xml_diff>
--- a/CV_Programador.docx
+++ b/CV_Programador.docx
@@ -45,7 +45,7 @@
         </w:rPr>
         <w:t xml:space="preserve">Córdoba, Argentina  ·  +54 9 351 370 3119  ·  </w:t>
       </w:r>
-      <w:hyperlink w:history="1" r:id="rId5o4lemz7udfwb64ujfs5j">
+      <w:hyperlink w:history="1" r:id="rIdkkns1wav1xiaqcaot8vqy">
         <w:r>
           <w:rPr>
             <w:rStyle w:val="Hyperlink"/>
@@ -61,7 +61,7 @@
         <w:spacing w:after="60"/>
         <w:jc w:val="center"/>
       </w:pPr>
-      <w:hyperlink w:history="1" r:id="rIdm1zykpvriel3b_kpsasbp">
+      <w:hyperlink w:history="1" r:id="rIdj8voepvxugn0tusgxrqj2">
         <w:r>
           <w:rPr>
             <w:rStyle w:val="Hyperlink"/>
@@ -79,7 +79,7 @@
         </w:rPr>
         <w:t xml:space="preserve">   ·   </w:t>
       </w:r>
-      <w:hyperlink w:history="1" r:id="rIdcyhc2y1k932i0cbiquhc9">
+      <w:hyperlink w:history="1" r:id="rIdotyqa8uevmnnexkwgc0ja">
         <w:r>
           <w:rPr>
             <w:rStyle w:val="Hyperlink"/>
@@ -97,7 +97,7 @@
         </w:rPr>
         <w:t xml:space="preserve">   ·   </w:t>
       </w:r>
-      <w:hyperlink w:history="1" r:id="rIdrk5_v3f2sg67lx5edlxrd">
+      <w:hyperlink w:history="1" r:id="rIdhlhtgiqnbcmks2ksif5cp">
         <w:r>
           <w:rPr>
             <w:rStyle w:val="Hyperlink"/>

</xml_diff>

<commit_message>
Agregar foto de perfil al sitio y al CV
</commit_message>
<xml_diff>
--- a/CV_Programador.docx
+++ b/CV_Programador.docx
@@ -4,6 +4,52 @@
   <w:body>
     <w:p>
       <w:pPr>
+        <w:spacing w:after="80"/>
+        <w:jc w:val="center"/>
+      </w:pPr>
+      <w:r>
+        <w:drawing>
+          <wp:inline distT="0" distB="0" distL="0" distR="0">
+            <wp:extent cx="952500" cy="1162050"/>
+            <wp:effectExtent t="0" r="0" b="0" l="0"/>
+            <wp:docPr id="1" name="foto" descr="Foto de perfil" title="Foto"/>
+            <wp:cNvGraphicFramePr>
+              <a:graphicFrameLocks xmlns:a="http://schemas.openxmlformats.org/drawingml/2006/main" noChangeAspect="1"/>
+            </wp:cNvGraphicFramePr>
+            <a:graphic xmlns:a="http://schemas.openxmlformats.org/drawingml/2006/main">
+              <a:graphicData uri="http://schemas.openxmlformats.org/drawingml/2006/picture">
+                <pic:pic xmlns:pic="http://schemas.openxmlformats.org/drawingml/2006/picture">
+                  <pic:nvPicPr>
+                    <pic:cNvPr id="0" name="" descr=""/>
+                    <pic:cNvPicPr>
+                      <a:picLocks noChangeAspect="1" noChangeArrowheads="1"/>
+                    </pic:cNvPicPr>
+                  </pic:nvPicPr>
+                  <pic:blipFill>
+                    <a:blip r:embed="rId7" cstate="none"/>
+                    <a:srcRect/>
+                    <a:stretch>
+                      <a:fillRect/>
+                    </a:stretch>
+                  </pic:blipFill>
+                  <pic:spPr bwMode="auto">
+                    <a:xfrm>
+                      <a:off x="0" y="0"/>
+                      <a:ext cx="952500" cy="1162050"/>
+                    </a:xfrm>
+                    <a:prstGeom prst="rect">
+                      <a:avLst/>
+                    </a:prstGeom>
+                  </pic:spPr>
+                </pic:pic>
+              </a:graphicData>
+            </a:graphic>
+          </wp:inline>
+        </w:drawing>
+      </w:r>
+    </w:p>
+    <w:p>
+      <w:pPr>
         <w:spacing w:after="20"/>
         <w:jc w:val="center"/>
       </w:pPr>
@@ -45,7 +91,7 @@
         </w:rPr>
         <w:t xml:space="preserve">Córdoba, Argentina  ·  +54 9 351 370 3119  ·  </w:t>
       </w:r>
-      <w:hyperlink w:history="1" r:id="rIdkkns1wav1xiaqcaot8vqy">
+      <w:hyperlink w:history="1" r:id="rIdnkowvbmtwawrlmbxwqbn6">
         <w:r>
           <w:rPr>
             <w:rStyle w:val="Hyperlink"/>
@@ -61,7 +107,7 @@
         <w:spacing w:after="60"/>
         <w:jc w:val="center"/>
       </w:pPr>
-      <w:hyperlink w:history="1" r:id="rIdj8voepvxugn0tusgxrqj2">
+      <w:hyperlink w:history="1" r:id="rId94b1zq2fzwxapbl14idcb">
         <w:r>
           <w:rPr>
             <w:rStyle w:val="Hyperlink"/>
@@ -79,7 +125,7 @@
         </w:rPr>
         <w:t xml:space="preserve">   ·   </w:t>
       </w:r>
-      <w:hyperlink w:history="1" r:id="rIdotyqa8uevmnnexkwgc0ja">
+      <w:hyperlink w:history="1" r:id="rIdlkx7yiusoa9avluazkeg3">
         <w:r>
           <w:rPr>
             <w:rStyle w:val="Hyperlink"/>
@@ -97,7 +143,7 @@
         </w:rPr>
         <w:t xml:space="preserve">   ·   </w:t>
       </w:r>
-      <w:hyperlink w:history="1" r:id="rIdhlhtgiqnbcmks2ksif5cp">
+      <w:hyperlink w:history="1" r:id="rIdygyg_yyamv2bvw0ec_d8v">
         <w:r>
           <w:rPr>
             <w:rStyle w:val="Hyperlink"/>

</xml_diff>

<commit_message>
Agregar seccion Desarrollo con IA (Claude) al portfolio y CV
</commit_message>
<xml_diff>
--- a/CV_Programador.docx
+++ b/CV_Programador.docx
@@ -91,7 +91,7 @@
         </w:rPr>
         <w:t xml:space="preserve">Córdoba, Argentina  ·  +54 9 351 370 3119  ·  </w:t>
       </w:r>
-      <w:hyperlink w:history="1" r:id="rIdnkowvbmtwawrlmbxwqbn6">
+      <w:hyperlink w:history="1" r:id="rIdo8v34tcpm_csjpt7p116i">
         <w:r>
           <w:rPr>
             <w:rStyle w:val="Hyperlink"/>
@@ -107,7 +107,7 @@
         <w:spacing w:after="60"/>
         <w:jc w:val="center"/>
       </w:pPr>
-      <w:hyperlink w:history="1" r:id="rId94b1zq2fzwxapbl14idcb">
+      <w:hyperlink w:history="1" r:id="rId0bt1uxurx_opofar2kjys">
         <w:r>
           <w:rPr>
             <w:rStyle w:val="Hyperlink"/>
@@ -125,7 +125,7 @@
         </w:rPr>
         <w:t xml:space="preserve">   ·   </w:t>
       </w:r>
-      <w:hyperlink w:history="1" r:id="rIdlkx7yiusoa9avluazkeg3">
+      <w:hyperlink w:history="1" r:id="rIdcmrapb8w7mofn0pbhkluu">
         <w:r>
           <w:rPr>
             <w:rStyle w:val="Hyperlink"/>
@@ -143,7 +143,7 @@
         </w:rPr>
         <w:t xml:space="preserve">   ·   </w:t>
       </w:r>
-      <w:hyperlink w:history="1" r:id="rIdygyg_yyamv2bvw0ec_d8v">
+      <w:hyperlink w:history="1" r:id="rIdycuhzyzakq4ntnsuuzbpv">
         <w:r>
           <w:rPr>
             <w:rStyle w:val="Hyperlink"/>
@@ -182,7 +182,7 @@
           <w:sz w:val="21"/>
           <w:szCs w:val="21"/>
         </w:rPr>
-        <w:t xml:space="preserve">Estudiante avanzado / recién egresado de Ingeniería en Sistemas de Información (UTN-FRC) con sólida base en programación orientada a objetos, patrones de diseño y desarrollo full stack. Experiencia práctica construyendo aplicaciones reales con Java + Spring Boot y C#/.NET en el backend, y Angular en el frontend, integrando bases de datos relacionales (SQL Server) y NoSQL (MongoDB). Perfil proactivo, ordenado y con foco en escribir código limpio, testeado y mantenible. Busco mi primera experiencia profesional como desarrollador junior para seguir creciendo en un equipo técnico.</w:t>
+        <w:t xml:space="preserve">Estudiante de la Tecnicatura Universitaria en Programación (UTN-FRC) con sólida base en programación orientada a objetos, patrones de diseño y desarrollo full stack. Experiencia práctica construyendo aplicaciones reales con Java + Spring Boot y C#/.NET en el backend, y Angular en el frontend, integrando bases de datos relacionales (SQL Server) y NoSQL (MongoDB). Incorporo herramientas de IA (Claude) en mi flujo de trabajo para programar con mayor velocidad y calidad, revisando siempre cada línea. Perfil proactivo, con alta predisposición para aprender y para adaptarse rápido a nuevas tecnologías. Busco mi primera experiencia profesional como desarrollador junior para seguir creciendo en un equipo técnico.</w:t>
       </w:r>
     </w:p>
     <w:p>
@@ -382,6 +382,28 @@
     </w:p>
     <w:p>
       <w:pPr>
+        <w:spacing w:after="70"/>
+      </w:pPr>
+      <w:r>
+        <w:rPr>
+          <w:b/>
+          <w:bCs/>
+          <w:color w:val="404040"/>
+          <w:sz w:val="21"/>
+          <w:szCs w:val="21"/>
+        </w:rPr>
+        <w:t xml:space="preserve">Desarrollo con IA:  </w:t>
+      </w:r>
+      <w:r>
+        <w:rPr>
+          <w:sz w:val="21"/>
+          <w:szCs w:val="21"/>
+        </w:rPr>
+        <w:t xml:space="preserve">Claude Code, Claude API, prompt engineering, programación asistida por IA</w:t>
+      </w:r>
+    </w:p>
+    <w:p>
+      <w:pPr>
         <w:pBdr>
           <w:bottom w:val="single" w:color="2E75B6" w:sz="6" w:space="2"/>
         </w:pBdr>
@@ -396,6 +418,105 @@
           <w:sz w:val="24"/>
           <w:szCs w:val="24"/>
         </w:rPr>
+        <w:t xml:space="preserve">DESARROLLO ASISTIDO POR IA</w:t>
+      </w:r>
+    </w:p>
+    <w:p>
+      <w:pPr>
+        <w:spacing w:after="80"/>
+      </w:pPr>
+      <w:r>
+        <w:rPr>
+          <w:sz w:val="21"/>
+          <w:szCs w:val="21"/>
+        </w:rPr>
+        <w:t xml:space="preserve">Integro la inteligencia artificial en mi proceso de desarrollo de forma responsable, revisando y comprendiendo todo el código generado. Trabajo principalmente con herramientas de Claude (Anthropic):</w:t>
+      </w:r>
+    </w:p>
+    <w:p>
+      <w:pPr>
+        <w:pStyle w:val="ListParagraph"/>
+        <w:numPr>
+          <w:ilvl w:val="0"/>
+          <w:numId w:val="2"/>
+        </w:numPr>
+        <w:spacing w:after="60"/>
+      </w:pPr>
+      <w:r>
+        <w:rPr>
+          <w:sz w:val="21"/>
+          <w:szCs w:val="21"/>
+        </w:rPr>
+        <w:t xml:space="preserve">Claude Code: asistente en la terminal para escribir, refactorizar y depurar código, generar pruebas unitarias y documentación.</w:t>
+      </w:r>
+    </w:p>
+    <w:p>
+      <w:pPr>
+        <w:pStyle w:val="ListParagraph"/>
+        <w:numPr>
+          <w:ilvl w:val="0"/>
+          <w:numId w:val="2"/>
+        </w:numPr>
+        <w:spacing w:after="60"/>
+      </w:pPr>
+      <w:r>
+        <w:rPr>
+          <w:sz w:val="21"/>
+          <w:szCs w:val="21"/>
+        </w:rPr>
+        <w:t xml:space="preserve">Prompt engineering: redacción de prompts claros y con contexto para obtener resultados precisos.</w:t>
+      </w:r>
+    </w:p>
+    <w:p>
+      <w:pPr>
+        <w:pStyle w:val="ListParagraph"/>
+        <w:numPr>
+          <w:ilvl w:val="0"/>
+          <w:numId w:val="2"/>
+        </w:numPr>
+        <w:spacing w:after="60"/>
+      </w:pPr>
+      <w:r>
+        <w:rPr>
+          <w:sz w:val="21"/>
+          <w:szCs w:val="21"/>
+        </w:rPr>
+        <w:t xml:space="preserve">Claude API: integración de modelos de IA en aplicaciones propias (chatbots, automatizaciones y asistentes).</w:t>
+      </w:r>
+    </w:p>
+    <w:p>
+      <w:pPr>
+        <w:pStyle w:val="ListParagraph"/>
+        <w:numPr>
+          <w:ilvl w:val="0"/>
+          <w:numId w:val="2"/>
+        </w:numPr>
+        <w:spacing w:after="60"/>
+      </w:pPr>
+      <w:r>
+        <w:rPr>
+          <w:sz w:val="21"/>
+          <w:szCs w:val="21"/>
+        </w:rPr>
+        <w:t xml:space="preserve">IA como acelerador de aprendizaje: comprensión de bases de código nuevas y exploración de tecnologías y buenas prácticas.</w:t>
+      </w:r>
+    </w:p>
+    <w:p>
+      <w:pPr>
+        <w:pBdr>
+          <w:bottom w:val="single" w:color="2E75B6" w:sz="6" w:space="2"/>
+        </w:pBdr>
+        <w:spacing w:after="120" w:before="260"/>
+      </w:pPr>
+      <w:r>
+        <w:rPr>
+          <w:rFonts w:ascii="Calibri" w:cs="Calibri" w:eastAsia="Calibri" w:hAnsi="Calibri"/>
+          <w:b/>
+          <w:bCs/>
+          <w:color w:val="1F4E79"/>
+          <w:sz w:val="24"/>
+          <w:szCs w:val="24"/>
+        </w:rPr>
         <w:t xml:space="preserve">PROYECTOS DESTACADOS</w:t>
       </w:r>
     </w:p>
@@ -689,7 +810,7 @@
           <w:sz w:val="22"/>
           <w:szCs w:val="22"/>
         </w:rPr>
-        <w:t xml:space="preserve">Ingeniería en Sistemas de Información</w:t>
+        <w:t xml:space="preserve">Tecnicatura Universitaria en Programación</w:t>
       </w:r>
       <w:r>
         <w:rPr>
@@ -699,7 +820,7 @@
           <w:sz w:val="20"/>
           <w:szCs w:val="20"/>
         </w:rPr>
-        <w:t xml:space="preserve">	2021 – Actualidad</w:t>
+        <w:t xml:space="preserve">	[ año inicio ] – Actualidad</w:t>
       </w:r>
     </w:p>
     <w:p>
@@ -727,7 +848,7 @@
           <w:sz w:val="21"/>
           <w:szCs w:val="21"/>
         </w:rPr>
-        <w:t xml:space="preserve">Materias destacadas: Paradigmas de Programación, Diseño de Sistemas, Bases de Datos, Ingeniería de Software.</w:t>
+        <w:t xml:space="preserve">Materias destacadas: Programación I y II, Bases de Datos, Desarrollo de Software, Paradigmas de Programación.</w:t>
       </w:r>
     </w:p>
     <w:p>

</xml_diff>

<commit_message>
Corregir texto Sobre mi (Tecnicatura en Programacion, inicio 2024)
</commit_message>
<xml_diff>
--- a/CV_Programador.docx
+++ b/CV_Programador.docx
@@ -91,7 +91,7 @@
         </w:rPr>
         <w:t xml:space="preserve">Córdoba, Argentina  ·  +54 9 351 370 3119  ·  </w:t>
       </w:r>
-      <w:hyperlink w:history="1" r:id="rIdo8v34tcpm_csjpt7p116i">
+      <w:hyperlink w:history="1" r:id="rIdwzd-3tlnhb_hvyfedin8_">
         <w:r>
           <w:rPr>
             <w:rStyle w:val="Hyperlink"/>
@@ -107,7 +107,7 @@
         <w:spacing w:after="60"/>
         <w:jc w:val="center"/>
       </w:pPr>
-      <w:hyperlink w:history="1" r:id="rId0bt1uxurx_opofar2kjys">
+      <w:hyperlink w:history="1" r:id="rIdlg5goozxcefku65fnl2gl">
         <w:r>
           <w:rPr>
             <w:rStyle w:val="Hyperlink"/>
@@ -125,7 +125,7 @@
         </w:rPr>
         <w:t xml:space="preserve">   ·   </w:t>
       </w:r>
-      <w:hyperlink w:history="1" r:id="rIdcmrapb8w7mofn0pbhkluu">
+      <w:hyperlink w:history="1" r:id="rIdgsvwigv2uhxvk5acmco3r">
         <w:r>
           <w:rPr>
             <w:rStyle w:val="Hyperlink"/>
@@ -143,7 +143,7 @@
         </w:rPr>
         <w:t xml:space="preserve">   ·   </w:t>
       </w:r>
-      <w:hyperlink w:history="1" r:id="rIdycuhzyzakq4ntnsuuzbpv">
+      <w:hyperlink w:history="1" r:id="rIdtntbu8ihvbhavophsfyac">
         <w:r>
           <w:rPr>
             <w:rStyle w:val="Hyperlink"/>
@@ -820,7 +820,7 @@
           <w:sz w:val="20"/>
           <w:szCs w:val="20"/>
         </w:rPr>
-        <w:t xml:space="preserve">	[ año inicio ] – Actualidad</w:t>
+        <w:t xml:space="preserve">	2024 – Actualidad</w:t>
       </w:r>
     </w:p>
     <w:p>

</xml_diff>

<commit_message>
Agregar seccion Idiomas con banderas y efecto 3D
</commit_message>
<xml_diff>
--- a/CV_Programador.docx
+++ b/CV_Programador.docx
@@ -91,7 +91,7 @@
         </w:rPr>
         <w:t xml:space="preserve">Córdoba, Argentina  ·  +54 9 351 370 3119  ·  </w:t>
       </w:r>
-      <w:hyperlink w:history="1" r:id="rIdwzd-3tlnhb_hvyfedin8_">
+      <w:hyperlink w:history="1" r:id="rIdf6zcumbwrzgdtudgjid_d">
         <w:r>
           <w:rPr>
             <w:rStyle w:val="Hyperlink"/>
@@ -107,7 +107,7 @@
         <w:spacing w:after="60"/>
         <w:jc w:val="center"/>
       </w:pPr>
-      <w:hyperlink w:history="1" r:id="rIdlg5goozxcefku65fnl2gl">
+      <w:hyperlink w:history="1" r:id="rIdhxiw9dn5dy4kld6zn8w3m">
         <w:r>
           <w:rPr>
             <w:rStyle w:val="Hyperlink"/>
@@ -125,7 +125,7 @@
         </w:rPr>
         <w:t xml:space="preserve">   ·   </w:t>
       </w:r>
-      <w:hyperlink w:history="1" r:id="rIdgsvwigv2uhxvk5acmco3r">
+      <w:hyperlink w:history="1" r:id="rIdmmdvaby46gl0mfcnkhukt">
         <w:r>
           <w:rPr>
             <w:rStyle w:val="Hyperlink"/>
@@ -143,7 +143,7 @@
         </w:rPr>
         <w:t xml:space="preserve">   ·   </w:t>
       </w:r>
-      <w:hyperlink w:history="1" r:id="rIdtntbu8ihvbhavophsfyac">
+      <w:hyperlink w:history="1" r:id="rId5l8tujm6w8pobxbge7eqt">
         <w:r>
           <w:rPr>
             <w:rStyle w:val="Hyperlink"/>
@@ -981,7 +981,29 @@
           <w:sz w:val="21"/>
           <w:szCs w:val="21"/>
         </w:rPr>
-        <w:t xml:space="preserve">Intermedio — lectura técnica fluida (B1/B2)</w:t>
+        <w:t xml:space="preserve">Intermedio — B1/B2, lectura técnica fluida</w:t>
+      </w:r>
+    </w:p>
+    <w:p>
+      <w:pPr>
+        <w:spacing w:after="70"/>
+      </w:pPr>
+      <w:r>
+        <w:rPr>
+          <w:b/>
+          <w:bCs/>
+          <w:color w:val="404040"/>
+          <w:sz w:val="21"/>
+          <w:szCs w:val="21"/>
+        </w:rPr>
+        <w:t xml:space="preserve">Portugués:  </w:t>
+      </w:r>
+      <w:r>
+        <w:rPr>
+          <w:sz w:val="21"/>
+          <w:szCs w:val="21"/>
+        </w:rPr>
+        <w:t xml:space="preserve">Avanzado</w:t>
       </w:r>
     </w:p>
     <w:sectPr>

</xml_diff>